<commit_message>
Run the same notebooks in Google Colab (no installation on the PCs)
- Every notebook starts with a cell that, only in Colab, clones this
  repository, installs fastapi/uvicorn where needed and moves into the
  notebook's folder; on a lab PC it does nothing.
- Ready-trained models (artifacts/) are now in the repository, so the
  "inside the model" and serving parts work on their own (each Colab
  notebook runs on its own machine).
- Serving notebooks show a Colab proxy link to /docs and the web form;
  the web forms call relative URLs so they work behind the proxy.
- README: "Running in Google Colab" section with Open-in-Colab links.
- IT setup guide v1.1: section 8 (Colab requirements, network, accounts,
  troubleshooting); exercise description updated.

Co-Authored-By: Claude Opus 5.5 <noreply@anthropic.com>
Claude-Session: https://claude.ai/code/session_01T8ves2m2YhbnkRZGCkgsnW
</commit_message>
<xml_diff>
--- a/docs/AI_Lab_Exercises_Description.docx
+++ b/docs/AI_Lab_Exercises_Description.docx
@@ -43,7 +43,7 @@
           <w:sz w:val="18"/>
           <w:szCs w:val="18"/>
         </w:rPr>
-        <w:t xml:space="preserve">Prepared by Giuseppe Frau · September 2026 · Version 1.0</w:t>
+        <w:t xml:space="preserve">Prepared by Giuseppe Frau · October 2026 · Version 1.1</w:t>
       </w:r>
     </w:p>
     <w:p>
@@ -2527,10 +2527,30 @@
           <w:b/>
           <w:bCs/>
         </w:rPr>
-        <w:t xml:space="preserve">Self-contained:</w:t>
-      </w:r>
-      <w:r>
-        <w:t xml:space="preserve"> all data files are pre-installed on the workstations. The exercises need no internet access, no cloud service and no account.</w:t>
+        <w:t xml:space="preserve">Two ways to run, same notebooks:</w:t>
+      </w:r>
+      <w:r>
+        <w:t xml:space="preserve"> </w:t>
+      </w:r>
+      <w:r>
+        <w:rPr>
+          <w:b/>
+          <w:bCs/>
+        </w:rPr>
+        <w:t xml:space="preserve">locally</w:t>
+      </w:r>
+      <w:r>
+        <w:t xml:space="preserve"> on the lab workstations (all data pre-installed; no internet access, cloud service or account needed during the session), or in </w:t>
+      </w:r>
+      <w:r>
+        <w:rPr>
+          <w:b/>
+          <w:bCs/>
+        </w:rPr>
+        <w:t xml:space="preserve">Google Colab</w:t>
+      </w:r>
+      <w:r>
+        <w:t xml:space="preserve"> when software cannot be installed on the workstations (only a web browser, internet access and a Google account per participant; the notebooks fetch data and code from the public course repository by themselves).</w:t>
       </w:r>
     </w:p>
     <w:p>
@@ -2605,7 +2625,7 @@
         <w:t xml:space="preserve">IT setup guide</w:t>
       </w:r>
       <w:r>
-        <w:t xml:space="preserve"> gives the workstation requirements, the installation steps and a check script that confirms each machine is ready.</w:t>
+        <w:t xml:space="preserve"> gives the workstation requirements, the installation steps, a check script that confirms each machine is ready, and the requirements for the Google Colab option.</w:t>
       </w:r>
     </w:p>
     <w:p>
@@ -3017,7 +3037,7 @@
       <w:pPr>
         <w:spacing w:after="80"/>
       </w:pPr>
-      <w:hyperlink w:history="1" r:id="rId8qruodhzbbcx5wkctytyi">
+      <w:hyperlink w:history="1" r:id="rIdxl4oucwcvsz4kfhas_q7p">
         <w:r>
           <w:rPr>
             <w:rStyle w:val="Hyperlink"/>
@@ -3030,7 +3050,7 @@
       <w:pPr>
         <w:spacing w:after="80"/>
       </w:pPr>
-      <w:hyperlink w:history="1" r:id="rIdybvrzqv3p7gfilmwunjxp">
+      <w:hyperlink w:history="1" r:id="rIdixyiwkawxpjztluq6rigg">
         <w:r>
           <w:rPr>
             <w:rStyle w:val="Hyperlink"/>

</xml_diff>